<commit_message>
Updating Notes & Worksheets
Updating:
Calc 3: 1.7 notes
Calc 1:  Blended session 2.3 problems
</commit_message>
<xml_diff>
--- a/Course Materials/Calc 1/Blended Sessions/Unit 1/2.3 Limit Challenge Problems.docx
+++ b/Course Materials/Calc 1/Blended Sessions/Unit 1/2.3 Limit Challenge Problems.docx
@@ -22,17 +22,83 @@
           <w:sz w:val="24"/>
           <w:szCs w:val="24"/>
         </w:rPr>
-        <w:t xml:space="preserve">Directions:  </w:t>
-      </w:r>
+        <w:t>Directions</w:t>
+      </w:r>
+      <w:proofErr w:type="gramStart"/>
       <w:r>
         <w:rPr>
           <w:rFonts w:ascii="Times New Roman" w:hAnsi="Times New Roman" w:cs="Times New Roman"/>
-          <w:bCs/>
+          <w:b/>
           <w:color w:val="000000"/>
           <w:sz w:val="24"/>
           <w:szCs w:val="24"/>
         </w:rPr>
-        <w:t>The goal of the following problems is to help challenge and deepen your understanding of the current topic.  Don’t assume that you will know how to answer each and every question.  You will work with at least two other students in the class to try and find solutions and write arguments for each of the following questions.  Be sure that you question your classmates’ reasoning.  If you don’t understand how they are getting something you should ASK THEM TO EXPLAIN!  Being able to defend your reasoning is important and so you are actually helping them by asking them to explain.</w:t>
+        <w:t xml:space="preserve">:  </w:t>
+      </w:r>
+      <w:r>
+        <w:rPr>
+          <w:rFonts w:ascii="Times New Roman" w:hAnsi="Times New Roman" w:cs="Times New Roman"/>
+          <w:bCs/>
+          <w:color w:val="000000"/>
+          <w:sz w:val="24"/>
+          <w:szCs w:val="24"/>
+        </w:rPr>
+        <w:t>The</w:t>
+      </w:r>
+      <w:proofErr w:type="gramEnd"/>
+      <w:r>
+        <w:rPr>
+          <w:rFonts w:ascii="Times New Roman" w:hAnsi="Times New Roman" w:cs="Times New Roman"/>
+          <w:bCs/>
+          <w:color w:val="000000"/>
+          <w:sz w:val="24"/>
+          <w:szCs w:val="24"/>
+        </w:rPr>
+        <w:t xml:space="preserve"> goal of the following problems is to help challenge and deepen your understanding of the current topic.  Don’t assume that you will know how to answer </w:t>
+      </w:r>
+      <w:proofErr w:type="gramStart"/>
+      <w:r>
+        <w:rPr>
+          <w:rFonts w:ascii="Times New Roman" w:hAnsi="Times New Roman" w:cs="Times New Roman"/>
+          <w:bCs/>
+          <w:color w:val="000000"/>
+          <w:sz w:val="24"/>
+          <w:szCs w:val="24"/>
+        </w:rPr>
+        <w:t>each and every</w:t>
+      </w:r>
+      <w:proofErr w:type="gramEnd"/>
+      <w:r>
+        <w:rPr>
+          <w:rFonts w:ascii="Times New Roman" w:hAnsi="Times New Roman" w:cs="Times New Roman"/>
+          <w:bCs/>
+          <w:color w:val="000000"/>
+          <w:sz w:val="24"/>
+          <w:szCs w:val="24"/>
+        </w:rPr>
+        <w:t xml:space="preserve"> question.  You will work with at least two other students in the class to try and find solutions and write arguments for each of the following questions.  Be sure that you question your classmates’ reasoning.  If you don’t understand how they are getting something you should ASK THEM TO EXPLAIN!  Being able to defend your reasoning is important and so you are </w:t>
+      </w:r>
+      <w:proofErr w:type="gramStart"/>
+      <w:r>
+        <w:rPr>
+          <w:rFonts w:ascii="Times New Roman" w:hAnsi="Times New Roman" w:cs="Times New Roman"/>
+          <w:bCs/>
+          <w:color w:val="000000"/>
+          <w:sz w:val="24"/>
+          <w:szCs w:val="24"/>
+        </w:rPr>
+        <w:t>actually helping</w:t>
+      </w:r>
+      <w:proofErr w:type="gramEnd"/>
+      <w:r>
+        <w:rPr>
+          <w:rFonts w:ascii="Times New Roman" w:hAnsi="Times New Roman" w:cs="Times New Roman"/>
+          <w:bCs/>
+          <w:color w:val="000000"/>
+          <w:sz w:val="24"/>
+          <w:szCs w:val="24"/>
+        </w:rPr>
+        <w:t xml:space="preserve"> them by asking them to explain.</w:t>
       </w:r>
     </w:p>
     <w:p>
@@ -128,10 +194,10 @@
             <v:path o:extrusionok="f" gradientshapeok="t" o:connecttype="rect"/>
             <o:lock v:ext="edit" aspectratio="t"/>
           </v:shapetype>
-          <v:shape id="_x0000_i1025" type="#_x0000_t75" style="width:66pt;height:33.75pt" o:ole="">
+          <v:shape id="_x0000_i1025" type="#_x0000_t75" style="width:66pt;height:33.6pt" o:ole="">
             <v:imagedata r:id="rId7" o:title=""/>
           </v:shape>
-          <o:OLEObject Type="Embed" ProgID="Equation.DSMT4" ShapeID="_x0000_i1025" DrawAspect="Content" ObjectID="_1844965112" r:id="rId8"/>
+          <o:OLEObject Type="Embed" ProgID="Equation.DSMT4" ShapeID="_x0000_i1025" DrawAspect="Content" ObjectID="_1849804647" r:id="rId8"/>
         </w:object>
       </w:r>
     </w:p>
@@ -166,10 +232,10 @@
           <w:position w:val="-24"/>
         </w:rPr>
         <w:object w:dxaOrig="1140" w:dyaOrig="660" w14:anchorId="2DAEA547">
-          <v:shape id="_x0000_i1026" type="#_x0000_t75" style="width:57pt;height:33.75pt" o:ole="">
+          <v:shape id="_x0000_i1026" type="#_x0000_t75" style="width:57pt;height:33.6pt" o:ole="">
             <v:imagedata r:id="rId9" o:title=""/>
           </v:shape>
-          <o:OLEObject Type="Embed" ProgID="Equation.DSMT4" ShapeID="_x0000_i1026" DrawAspect="Content" ObjectID="_1844965113" r:id="rId10"/>
+          <o:OLEObject Type="Embed" ProgID="Equation.DSMT4" ShapeID="_x0000_i1026" DrawAspect="Content" ObjectID="_1849804648" r:id="rId10"/>
         </w:object>
       </w:r>
     </w:p>
@@ -232,10 +298,10 @@
           <w:position w:val="-24"/>
         </w:rPr>
         <w:object w:dxaOrig="279" w:dyaOrig="620" w14:anchorId="4CC7630A">
-          <v:shape id="_x0000_i1027" type="#_x0000_t75" style="width:14.25pt;height:30.75pt" o:ole="">
+          <v:shape id="_x0000_i1027" type="#_x0000_t75" style="width:14.4pt;height:30.6pt" o:ole="">
             <v:imagedata r:id="rId11" o:title=""/>
           </v:shape>
-          <o:OLEObject Type="Embed" ProgID="Equation.DSMT4" ShapeID="_x0000_i1027" DrawAspect="Content" ObjectID="_1844965114" r:id="rId12"/>
+          <o:OLEObject Type="Embed" ProgID="Equation.DSMT4" ShapeID="_x0000_i1027" DrawAspect="Content" ObjectID="_1849804649" r:id="rId12"/>
         </w:object>
       </w:r>
       <w:r>
@@ -262,10 +328,10 @@
           <w:position w:val="-24"/>
         </w:rPr>
         <w:object w:dxaOrig="240" w:dyaOrig="620" w14:anchorId="6D6D6902">
-          <v:shape id="_x0000_i1028" type="#_x0000_t75" style="width:12pt;height:30.75pt" o:ole="">
+          <v:shape id="_x0000_i1028" type="#_x0000_t75" style="width:12pt;height:30.6pt" o:ole="">
             <v:imagedata r:id="rId13" o:title=""/>
           </v:shape>
-          <o:OLEObject Type="Embed" ProgID="Equation.DSMT4" ShapeID="_x0000_i1028" DrawAspect="Content" ObjectID="_1844965115" r:id="rId14"/>
+          <o:OLEObject Type="Embed" ProgID="Equation.DSMT4" ShapeID="_x0000_i1028" DrawAspect="Content" ObjectID="_1849804650" r:id="rId14"/>
         </w:object>
       </w:r>
       <w:r>
@@ -295,7 +361,7 @@
           <v:shape id="_x0000_i1029" type="#_x0000_t75" style="width:12pt;height:9pt" o:ole="">
             <v:imagedata r:id="rId15" o:title=""/>
           </v:shape>
-          <o:OLEObject Type="Embed" ProgID="Equation.DSMT4" ShapeID="_x0000_i1029" DrawAspect="Content" ObjectID="_1844965116" r:id="rId16"/>
+          <o:OLEObject Type="Embed" ProgID="Equation.DSMT4" ShapeID="_x0000_i1029" DrawAspect="Content" ObjectID="_1849804651" r:id="rId16"/>
         </w:object>
       </w:r>
       <w:r>
@@ -442,10 +508,10 @@
           <w:position w:val="-56"/>
         </w:rPr>
         <w:object w:dxaOrig="2220" w:dyaOrig="980" w14:anchorId="2089A99D">
-          <v:shape id="_x0000_i1030" type="#_x0000_t75" style="width:110.2pt;height:48.75pt" o:ole="">
+          <v:shape id="_x0000_i1030" type="#_x0000_t75" style="width:110.4pt;height:48.6pt" o:ole="">
             <v:imagedata r:id="rId17" o:title=""/>
           </v:shape>
-          <o:OLEObject Type="Embed" ProgID="Equation.DSMT4" ShapeID="_x0000_i1030" DrawAspect="Content" ObjectID="_1844965117" r:id="rId18"/>
+          <o:OLEObject Type="Embed" ProgID="Equation.DSMT4" ShapeID="_x0000_i1030" DrawAspect="Content" ObjectID="_1849804652" r:id="rId18"/>
         </w:object>
       </w:r>
       <w:r>
@@ -479,10 +545,10 @@
           <w:position w:val="-54"/>
         </w:rPr>
         <w:object w:dxaOrig="7360" w:dyaOrig="1200" w14:anchorId="3622ED0C">
-          <v:shape id="_x0000_i1031" type="#_x0000_t75" style="width:368.35pt;height:60pt" o:ole="">
+          <v:shape id="_x0000_i1031" type="#_x0000_t75" style="width:368.4pt;height:60pt" o:ole="">
             <v:imagedata r:id="rId19" o:title=""/>
           </v:shape>
-          <o:OLEObject Type="Embed" ProgID="Equation.DSMT4" ShapeID="_x0000_i1031" DrawAspect="Content" ObjectID="_1844965118" r:id="rId20"/>
+          <o:OLEObject Type="Embed" ProgID="Equation.DSMT4" ShapeID="_x0000_i1031" DrawAspect="Content" ObjectID="_1849804653" r:id="rId20"/>
         </w:object>
       </w:r>
       <w:r>
@@ -530,10 +596,10 @@
           <w:position w:val="-24"/>
         </w:rPr>
         <w:object w:dxaOrig="1240" w:dyaOrig="700" w14:anchorId="03559F36">
-          <v:shape id="_x0000_i1032" type="#_x0000_t75" style="width:63pt;height:35.25pt" o:ole="">
+          <v:shape id="_x0000_i1032" type="#_x0000_t75" style="width:63pt;height:35.4pt" o:ole="">
             <v:imagedata r:id="rId21" o:title=""/>
           </v:shape>
-          <o:OLEObject Type="Embed" ProgID="Equation.DSMT4" ShapeID="_x0000_i1032" DrawAspect="Content" ObjectID="_1844965119" r:id="rId22"/>
+          <o:OLEObject Type="Embed" ProgID="Equation.DSMT4" ShapeID="_x0000_i1032" DrawAspect="Content" ObjectID="_1849804654" r:id="rId22"/>
         </w:object>
       </w:r>
       <w:r>
@@ -680,34 +746,39 @@
     </w:p>
     <w:p>
       <w:pPr>
-        <w:rPr>
-          <w:bCs/>
-        </w:rPr>
-      </w:pPr>
-    </w:p>
-    <w:p>
-      <w:pPr>
-        <w:rPr>
-          <w:bCs/>
-        </w:rPr>
-      </w:pPr>
-    </w:p>
-    <w:p>
-      <w:pPr>
-        <w:rPr>
-          <w:bCs/>
-        </w:rPr>
-      </w:pPr>
-    </w:p>
-    <w:p>
-      <w:pPr>
-        <w:rPr>
-          <w:bCs/>
-        </w:rPr>
-      </w:pPr>
-    </w:p>
-    <w:p>
-      <w:pPr>
+        <w:ind w:firstLine="720"/>
+        <w:rPr>
+          <w:bCs/>
+        </w:rPr>
+      </w:pPr>
+    </w:p>
+    <w:p>
+      <w:pPr>
+        <w:ind w:firstLine="720"/>
+        <w:rPr>
+          <w:bCs/>
+        </w:rPr>
+      </w:pPr>
+    </w:p>
+    <w:p>
+      <w:pPr>
+        <w:ind w:firstLine="720"/>
+        <w:rPr>
+          <w:bCs/>
+        </w:rPr>
+      </w:pPr>
+    </w:p>
+    <w:p>
+      <w:pPr>
+        <w:ind w:firstLine="720"/>
+        <w:rPr>
+          <w:bCs/>
+        </w:rPr>
+      </w:pPr>
+    </w:p>
+    <w:p>
+      <w:pPr>
+        <w:ind w:firstLine="720"/>
         <w:rPr>
           <w:bCs/>
         </w:rPr>
@@ -721,33 +792,47 @@
           <w:numId w:val="23"/>
         </w:numPr>
         <w:rPr>
-          <w:szCs w:val="24"/>
-        </w:rPr>
-      </w:pPr>
-      <w:r>
-        <w:rPr>
-          <w:szCs w:val="24"/>
-        </w:rPr>
-        <w:t xml:space="preserve">Determine the horizontal and vertical asymptotes to </w:t>
-      </w:r>
-      <w:r>
-        <w:rPr>
+          <w:bCs/>
+        </w:rPr>
+      </w:pPr>
+      <w:r>
+        <w:rPr>
+          <w:bCs/>
+        </w:rPr>
+        <w:t xml:space="preserve">Evaluate the limit </w:t>
+      </w:r>
+      <w:r>
+        <w:rPr>
+          <w:bCs/>
           <w:position w:val="-24"/>
-          <w:szCs w:val="24"/>
-        </w:rPr>
-        <w:object w:dxaOrig="1500" w:dyaOrig="660" w14:anchorId="70F18503">
-          <v:shape id="_x0000_i1033" type="#_x0000_t75" style="width:75pt;height:33.75pt" o:ole="">
+        </w:rPr>
+        <w:object w:dxaOrig="1280" w:dyaOrig="700" w14:anchorId="05108F7A">
+          <v:shape id="_x0000_i1050" type="#_x0000_t75" style="width:64.8pt;height:35.4pt" o:ole="">
             <v:imagedata r:id="rId23" o:title=""/>
           </v:shape>
-          <o:OLEObject Type="Embed" ProgID="Equation.DSMT4" ShapeID="_x0000_i1033" DrawAspect="Content" ObjectID="_1844965120" r:id="rId24"/>
+          <o:OLEObject Type="Embed" ProgID="Equation.DSMT4" ShapeID="_x0000_i1050" DrawAspect="Content" ObjectID="_1849804655" r:id="rId24"/>
         </w:object>
       </w:r>
-    </w:p>
-    <w:p>
-      <w:pPr>
-        <w:ind w:left="720"/>
-        <w:rPr>
-          <w:szCs w:val="24"/>
+      <w:r>
+        <w:rPr>
+          <w:bCs/>
+        </w:rPr>
+        <w:t>providing full justification.</w:t>
+      </w:r>
+    </w:p>
+    <w:p>
+      <w:pPr>
+        <w:ind w:firstLine="720"/>
+        <w:rPr>
+          <w:bCs/>
+        </w:rPr>
+      </w:pPr>
+    </w:p>
+    <w:p>
+      <w:pPr>
+        <w:ind w:firstLine="720"/>
+        <w:rPr>
+          <w:bCs/>
         </w:rPr>
       </w:pPr>
     </w:p>
@@ -906,27 +991,213 @@
           <w:numId w:val="23"/>
         </w:numPr>
         <w:rPr>
-          <w:bCs/>
-        </w:rPr>
-      </w:pPr>
-      <w:r>
-        <w:rPr>
-          <w:bCs/>
-        </w:rPr>
+          <w:szCs w:val="24"/>
+        </w:rPr>
+      </w:pPr>
+      <w:r>
+        <w:rPr>
+          <w:szCs w:val="24"/>
+        </w:rPr>
+        <w:lastRenderedPageBreak/>
         <w:t xml:space="preserve">Determine the horizontal and vertical asymptotes to </w:t>
       </w:r>
       <w:r>
         <w:rPr>
-          <w:bCs/>
-          <w:position w:val="-80"/>
-        </w:rPr>
-        <w:object w:dxaOrig="2880" w:dyaOrig="1719" w14:anchorId="617C584A">
-          <v:shape id="_x0000_i1034" type="#_x0000_t75" style="width:2in;height:86.2pt" o:ole="">
+          <w:position w:val="-24"/>
+          <w:szCs w:val="24"/>
+        </w:rPr>
+        <w:object w:dxaOrig="1500" w:dyaOrig="660" w14:anchorId="70F18503">
+          <v:shape id="_x0000_i1033" type="#_x0000_t75" style="width:75pt;height:33.6pt" o:ole="">
             <v:imagedata r:id="rId25" o:title=""/>
           </v:shape>
-          <o:OLEObject Type="Embed" ProgID="Equation.DSMT4" ShapeID="_x0000_i1034" DrawAspect="Content" ObjectID="_1844965121" r:id="rId26"/>
+          <o:OLEObject Type="Embed" ProgID="Equation.DSMT4" ShapeID="_x0000_i1033" DrawAspect="Content" ObjectID="_1849804656" r:id="rId26"/>
         </w:object>
       </w:r>
+    </w:p>
+    <w:p>
+      <w:pPr>
+        <w:ind w:left="720"/>
+        <w:rPr>
+          <w:szCs w:val="24"/>
+        </w:rPr>
+      </w:pPr>
+    </w:p>
+    <w:p>
+      <w:pPr>
+        <w:rPr>
+          <w:bCs/>
+        </w:rPr>
+      </w:pPr>
+    </w:p>
+    <w:p>
+      <w:pPr>
+        <w:rPr>
+          <w:bCs/>
+        </w:rPr>
+      </w:pPr>
+    </w:p>
+    <w:p>
+      <w:pPr>
+        <w:rPr>
+          <w:bCs/>
+        </w:rPr>
+      </w:pPr>
+    </w:p>
+    <w:p>
+      <w:pPr>
+        <w:rPr>
+          <w:bCs/>
+        </w:rPr>
+      </w:pPr>
+    </w:p>
+    <w:p>
+      <w:pPr>
+        <w:rPr>
+          <w:bCs/>
+        </w:rPr>
+      </w:pPr>
+    </w:p>
+    <w:p>
+      <w:pPr>
+        <w:rPr>
+          <w:bCs/>
+        </w:rPr>
+      </w:pPr>
+    </w:p>
+    <w:p>
+      <w:pPr>
+        <w:rPr>
+          <w:bCs/>
+        </w:rPr>
+      </w:pPr>
+    </w:p>
+    <w:p>
+      <w:pPr>
+        <w:rPr>
+          <w:bCs/>
+        </w:rPr>
+      </w:pPr>
+    </w:p>
+    <w:p>
+      <w:pPr>
+        <w:rPr>
+          <w:bCs/>
+        </w:rPr>
+      </w:pPr>
+    </w:p>
+    <w:p>
+      <w:pPr>
+        <w:rPr>
+          <w:bCs/>
+        </w:rPr>
+      </w:pPr>
+    </w:p>
+    <w:p>
+      <w:pPr>
+        <w:rPr>
+          <w:bCs/>
+        </w:rPr>
+      </w:pPr>
+    </w:p>
+    <w:p>
+      <w:pPr>
+        <w:rPr>
+          <w:bCs/>
+        </w:rPr>
+      </w:pPr>
+    </w:p>
+    <w:p>
+      <w:pPr>
+        <w:rPr>
+          <w:bCs/>
+        </w:rPr>
+      </w:pPr>
+    </w:p>
+    <w:p>
+      <w:pPr>
+        <w:rPr>
+          <w:bCs/>
+        </w:rPr>
+      </w:pPr>
+    </w:p>
+    <w:p>
+      <w:pPr>
+        <w:rPr>
+          <w:bCs/>
+        </w:rPr>
+      </w:pPr>
+    </w:p>
+    <w:p>
+      <w:pPr>
+        <w:rPr>
+          <w:bCs/>
+        </w:rPr>
+      </w:pPr>
+    </w:p>
+    <w:p>
+      <w:pPr>
+        <w:rPr>
+          <w:bCs/>
+        </w:rPr>
+      </w:pPr>
+    </w:p>
+    <w:p>
+      <w:pPr>
+        <w:rPr>
+          <w:bCs/>
+        </w:rPr>
+      </w:pPr>
+    </w:p>
+    <w:p>
+      <w:pPr>
+        <w:rPr>
+          <w:bCs/>
+        </w:rPr>
+      </w:pPr>
+    </w:p>
+    <w:p>
+      <w:pPr>
+        <w:rPr>
+          <w:bCs/>
+        </w:rPr>
+      </w:pPr>
+    </w:p>
+    <w:p>
+      <w:pPr>
+        <w:rPr>
+          <w:bCs/>
+        </w:rPr>
+      </w:pPr>
+    </w:p>
+    <w:p>
+      <w:pPr>
+        <w:pStyle w:val="ListParagraph"/>
+        <w:numPr>
+          <w:ilvl w:val="0"/>
+          <w:numId w:val="23"/>
+        </w:numPr>
+        <w:rPr>
+          <w:bCs/>
+        </w:rPr>
+      </w:pPr>
+      <w:r>
+        <w:rPr>
+          <w:bCs/>
+        </w:rPr>
+        <w:t xml:space="preserve">Determine the horizontal and vertical asymptotes to </w:t>
+      </w:r>
+      <w:r>
+        <w:rPr>
+          <w:bCs/>
+          <w:position w:val="-80"/>
+        </w:rPr>
+        <w:object w:dxaOrig="2880" w:dyaOrig="1719" w14:anchorId="617C584A">
+          <v:shape id="_x0000_i1034" type="#_x0000_t75" style="width:2in;height:86.4pt" o:ole="">
+            <v:imagedata r:id="rId27" o:title=""/>
+          </v:shape>
+          <o:OLEObject Type="Embed" ProgID="Equation.DSMT4" ShapeID="_x0000_i1034" DrawAspect="Content" ObjectID="_1849804657" r:id="rId28"/>
+        </w:object>
+      </w:r>
       <w:r>
         <w:rPr>
           <w:bCs/>
@@ -1028,13 +1299,63 @@
     <w:p>
       <w:pPr>
         <w:rPr>
-          <w:szCs w:val="24"/>
-        </w:rPr>
-      </w:pPr>
-      <w:r>
-        <w:rPr>
-          <w:szCs w:val="24"/>
-        </w:rPr>
+          <w:bCs/>
+        </w:rPr>
+      </w:pPr>
+    </w:p>
+    <w:p>
+      <w:pPr>
+        <w:rPr>
+          <w:bCs/>
+        </w:rPr>
+      </w:pPr>
+    </w:p>
+    <w:p>
+      <w:pPr>
+        <w:rPr>
+          <w:bCs/>
+        </w:rPr>
+      </w:pPr>
+    </w:p>
+    <w:p>
+      <w:pPr>
+        <w:rPr>
+          <w:bCs/>
+        </w:rPr>
+      </w:pPr>
+    </w:p>
+    <w:p>
+      <w:pPr>
+        <w:rPr>
+          <w:bCs/>
+        </w:rPr>
+      </w:pPr>
+    </w:p>
+    <w:p>
+      <w:pPr>
+        <w:rPr>
+          <w:bCs/>
+        </w:rPr>
+      </w:pPr>
+    </w:p>
+    <w:p>
+      <w:pPr>
+        <w:rPr>
+          <w:bCs/>
+        </w:rPr>
+      </w:pPr>
+    </w:p>
+    <w:p>
+      <w:pPr>
+        <w:rPr>
+          <w:szCs w:val="24"/>
+        </w:rPr>
+      </w:pPr>
+      <w:r>
+        <w:rPr>
+          <w:szCs w:val="24"/>
+        </w:rPr>
+        <w:lastRenderedPageBreak/>
         <w:t>Recall the limit laws that we discussed in class.</w:t>
       </w:r>
     </w:p>
@@ -1079,7 +1400,17 @@
                 <w:sz w:val="24"/>
                 <w:szCs w:val="24"/>
               </w:rPr>
-              <w:t>Theorem:</w:t>
+              <w:t>Theorem</w:t>
+            </w:r>
+            <w:proofErr w:type="gramStart"/>
+            <w:r>
+              <w:rPr>
+                <w:rFonts w:ascii="Times New Roman" w:hAnsi="Times New Roman" w:cs="Times New Roman"/>
+                <w:b/>
+                <w:sz w:val="24"/>
+                <w:szCs w:val="24"/>
+              </w:rPr>
+              <w:t>:</w:t>
             </w:r>
             <w:r>
               <w:rPr>
@@ -1087,7 +1418,16 @@
                 <w:sz w:val="24"/>
                 <w:szCs w:val="24"/>
               </w:rPr>
-              <w:t xml:space="preserve">  Suppose that </w:t>
+              <w:t xml:space="preserve">  Suppose</w:t>
+            </w:r>
+            <w:proofErr w:type="gramEnd"/>
+            <w:r>
+              <w:rPr>
+                <w:rFonts w:ascii="Times New Roman" w:hAnsi="Times New Roman" w:cs="Times New Roman"/>
+                <w:sz w:val="24"/>
+                <w:szCs w:val="24"/>
+              </w:rPr>
+              <w:t xml:space="preserve"> that </w:t>
             </w:r>
             <w:r>
               <w:rPr>
@@ -1129,10 +1469,10 @@
                 <w:position w:val="-20"/>
               </w:rPr>
               <w:object w:dxaOrig="920" w:dyaOrig="460" w14:anchorId="438D5AF2">
-                <v:shape id="_x0000_i1035" type="#_x0000_t75" style="width:45.75pt;height:22.5pt" o:ole="">
-                  <v:imagedata r:id="rId27" o:title=""/>
+                <v:shape id="_x0000_i1035" type="#_x0000_t75" style="width:45.6pt;height:22.2pt" o:ole="">
+                  <v:imagedata r:id="rId29" o:title=""/>
                 </v:shape>
-                <o:OLEObject Type="Embed" ProgID="Equation.DSMT4" ShapeID="_x0000_i1035" DrawAspect="Content" ObjectID="_1844965122" r:id="rId28"/>
+                <o:OLEObject Type="Embed" ProgID="Equation.DSMT4" ShapeID="_x0000_i1035" DrawAspect="Content" ObjectID="_1849804658" r:id="rId30"/>
               </w:object>
             </w:r>
             <w:bookmarkEnd w:id="0"/>
@@ -1149,10 +1489,10 @@
                 <w:position w:val="-20"/>
               </w:rPr>
               <w:object w:dxaOrig="920" w:dyaOrig="460" w14:anchorId="20E6E1BD">
-                <v:shape id="_x0000_i1036" type="#_x0000_t75" style="width:45.75pt;height:22.5pt" o:ole="">
-                  <v:imagedata r:id="rId29" o:title=""/>
+                <v:shape id="_x0000_i1036" type="#_x0000_t75" style="width:45.6pt;height:22.2pt" o:ole="">
+                  <v:imagedata r:id="rId31" o:title=""/>
                 </v:shape>
-                <o:OLEObject Type="Embed" ProgID="Equation.DSMT4" ShapeID="_x0000_i1036" DrawAspect="Content" ObjectID="_1844965123" r:id="rId30"/>
+                <o:OLEObject Type="Embed" ProgID="Equation.DSMT4" ShapeID="_x0000_i1036" DrawAspect="Content" ObjectID="_1849804659" r:id="rId32"/>
               </w:object>
             </w:r>
             <w:r>
@@ -1182,10 +1522,10 @@
                 <w:position w:val="-20"/>
               </w:rPr>
               <w:object w:dxaOrig="4000" w:dyaOrig="480" w14:anchorId="2C9C4309">
-                <v:shape id="_x0000_i1037" type="#_x0000_t75" style="width:201pt;height:23.25pt" o:ole="">
-                  <v:imagedata r:id="rId31" o:title=""/>
+                <v:shape id="_x0000_i1037" type="#_x0000_t75" style="width:201pt;height:23.4pt" o:ole="">
+                  <v:imagedata r:id="rId33" o:title=""/>
                 </v:shape>
-                <o:OLEObject Type="Embed" ProgID="Equation.DSMT4" ShapeID="_x0000_i1037" DrawAspect="Content" ObjectID="_1844965124" r:id="rId32"/>
+                <o:OLEObject Type="Embed" ProgID="Equation.DSMT4" ShapeID="_x0000_i1037" DrawAspect="Content" ObjectID="_1849804660" r:id="rId34"/>
               </w:object>
             </w:r>
           </w:p>
@@ -1207,10 +1547,10 @@
                 <w:position w:val="-20"/>
               </w:rPr>
               <w:object w:dxaOrig="3720" w:dyaOrig="480" w14:anchorId="09E3472B">
-                <v:shape id="_x0000_i1038" type="#_x0000_t75" style="width:186.75pt;height:23.25pt" o:ole="">
-                  <v:imagedata r:id="rId33" o:title=""/>
+                <v:shape id="_x0000_i1038" type="#_x0000_t75" style="width:186.6pt;height:23.4pt" o:ole="">
+                  <v:imagedata r:id="rId35" o:title=""/>
                 </v:shape>
-                <o:OLEObject Type="Embed" ProgID="Equation.DSMT4" ShapeID="_x0000_i1038" DrawAspect="Content" ObjectID="_1844965125" r:id="rId34"/>
+                <o:OLEObject Type="Embed" ProgID="Equation.DSMT4" ShapeID="_x0000_i1038" DrawAspect="Content" ObjectID="_1849804661" r:id="rId36"/>
               </w:object>
             </w:r>
           </w:p>
@@ -1247,59 +1587,73 @@
           <w:szCs w:val="24"/>
         </w:rPr>
         <w:object w:dxaOrig="920" w:dyaOrig="460" w14:anchorId="27B5C111">
-          <v:shape id="_x0000_i1039" type="#_x0000_t75" style="width:45.75pt;height:23.25pt" o:ole="">
-            <v:imagedata r:id="rId35" o:title=""/>
-          </v:shape>
-          <o:OLEObject Type="Embed" ProgID="Equation.DSMT4" ShapeID="_x0000_i1039" DrawAspect="Content" ObjectID="_1844965126" r:id="rId36"/>
-        </w:object>
-      </w:r>
-      <w:r>
-        <w:rPr>
-          <w:szCs w:val="24"/>
-        </w:rPr>
-        <w:t xml:space="preserve"> nor </w:t>
-      </w:r>
-      <w:r>
-        <w:rPr>
-          <w:position w:val="-20"/>
-          <w:szCs w:val="24"/>
-        </w:rPr>
-        <w:object w:dxaOrig="920" w:dyaOrig="460" w14:anchorId="02BC63D9">
-          <v:shape id="_x0000_i1040" type="#_x0000_t75" style="width:45.75pt;height:23.25pt" o:ole="">
+          <v:shape id="_x0000_i1039" type="#_x0000_t75" style="width:45.6pt;height:23.4pt" o:ole="">
             <v:imagedata r:id="rId37" o:title=""/>
           </v:shape>
-          <o:OLEObject Type="Embed" ProgID="Equation.DSMT4" ShapeID="_x0000_i1040" DrawAspect="Content" ObjectID="_1844965127" r:id="rId38"/>
+          <o:OLEObject Type="Embed" ProgID="Equation.DSMT4" ShapeID="_x0000_i1039" DrawAspect="Content" ObjectID="_1849804662" r:id="rId38"/>
         </w:object>
       </w:r>
       <w:r>
         <w:rPr>
           <w:szCs w:val="24"/>
         </w:rPr>
-        <w:t xml:space="preserve"> exists, then </w:t>
+        <w:t xml:space="preserve"> nor </w:t>
       </w:r>
       <w:r>
         <w:rPr>
           <w:position w:val="-20"/>
           <w:szCs w:val="24"/>
         </w:rPr>
-        <w:object w:dxaOrig="1840" w:dyaOrig="480" w14:anchorId="104F37EE">
-          <v:shape id="_x0000_i1041" type="#_x0000_t75" style="width:92.3pt;height:23.25pt" o:ole="">
+        <w:object w:dxaOrig="920" w:dyaOrig="460" w14:anchorId="02BC63D9">
+          <v:shape id="_x0000_i1040" type="#_x0000_t75" style="width:45.6pt;height:23.4pt" o:ole="">
             <v:imagedata r:id="rId39" o:title=""/>
           </v:shape>
-          <o:OLEObject Type="Embed" ProgID="Equation.DSMT4" ShapeID="_x0000_i1041" DrawAspect="Content" ObjectID="_1844965128" r:id="rId40"/>
+          <o:OLEObject Type="Embed" ProgID="Equation.DSMT4" ShapeID="_x0000_i1040" DrawAspect="Content" ObjectID="_1849804663" r:id="rId40"/>
         </w:object>
       </w:r>
       <w:r>
         <w:rPr>
           <w:szCs w:val="24"/>
         </w:rPr>
+        <w:t xml:space="preserve"> exists, then </w:t>
+      </w:r>
+      <w:r>
+        <w:rPr>
+          <w:position w:val="-20"/>
+          <w:szCs w:val="24"/>
+        </w:rPr>
+        <w:object w:dxaOrig="1840" w:dyaOrig="480" w14:anchorId="104F37EE">
+          <v:shape id="_x0000_i1041" type="#_x0000_t75" style="width:92.4pt;height:23.4pt" o:ole="">
+            <v:imagedata r:id="rId41" o:title=""/>
+          </v:shape>
+          <o:OLEObject Type="Embed" ProgID="Equation.DSMT4" ShapeID="_x0000_i1041" DrawAspect="Content" ObjectID="_1849804664" r:id="rId42"/>
+        </w:object>
+      </w:r>
+      <w:r>
+        <w:rPr>
+          <w:szCs w:val="24"/>
+        </w:rPr>
         <w:t xml:space="preserve"> must not exist.</w:t>
       </w:r>
       <w:r>
         <w:rPr>
           <w:szCs w:val="24"/>
         </w:rPr>
-        <w:t xml:space="preserve">  If the statement is true provide a justification demonstrating that it is true.  If the statement is false, provide a counter-example that shows the statement is false.</w:t>
+        <w:t xml:space="preserve">  If the statement is true provide a justification demonstrating that it is true.  If the statement is false, provide a </w:t>
+      </w:r>
+      <w:proofErr w:type="gramStart"/>
+      <w:r>
+        <w:rPr>
+          <w:szCs w:val="24"/>
+        </w:rPr>
+        <w:t>counter-example</w:t>
+      </w:r>
+      <w:proofErr w:type="gramEnd"/>
+      <w:r>
+        <w:rPr>
+          <w:szCs w:val="24"/>
+        </w:rPr>
+        <w:t xml:space="preserve"> that shows the statement is false.</w:t>
       </w:r>
     </w:p>
     <w:p>
@@ -1374,10 +1728,10 @@
           <w:szCs w:val="24"/>
         </w:rPr>
         <w:object w:dxaOrig="1740" w:dyaOrig="480" w14:anchorId="3BCB42F0">
-          <v:shape id="_x0000_i1042" type="#_x0000_t75" style="width:87pt;height:23.25pt" o:ole="">
-            <v:imagedata r:id="rId41" o:title=""/>
+          <v:shape id="_x0000_i1042" type="#_x0000_t75" style="width:87pt;height:23.4pt" o:ole="">
+            <v:imagedata r:id="rId43" o:title=""/>
           </v:shape>
-          <o:OLEObject Type="Embed" ProgID="Equation.DSMT4" ShapeID="_x0000_i1042" DrawAspect="Content" ObjectID="_1844965129" r:id="rId42"/>
+          <o:OLEObject Type="Embed" ProgID="Equation.DSMT4" ShapeID="_x0000_i1042" DrawAspect="Content" ObjectID="_1849804665" r:id="rId44"/>
         </w:object>
       </w:r>
       <w:r>
@@ -1392,41 +1746,55 @@
           <w:szCs w:val="24"/>
         </w:rPr>
         <w:object w:dxaOrig="920" w:dyaOrig="460" w14:anchorId="7FD3BA77">
-          <v:shape id="_x0000_i1043" type="#_x0000_t75" style="width:45.75pt;height:23.25pt" o:ole="">
-            <v:imagedata r:id="rId35" o:title=""/>
-          </v:shape>
-          <o:OLEObject Type="Embed" ProgID="Equation.DSMT4" ShapeID="_x0000_i1043" DrawAspect="Content" ObjectID="_1844965130" r:id="rId43"/>
-        </w:object>
-      </w:r>
-      <w:r>
-        <w:rPr>
-          <w:szCs w:val="24"/>
-        </w:rPr>
-        <w:t xml:space="preserve"> or </w:t>
-      </w:r>
-      <w:r>
-        <w:rPr>
-          <w:position w:val="-20"/>
-          <w:szCs w:val="24"/>
-        </w:rPr>
-        <w:object w:dxaOrig="920" w:dyaOrig="460" w14:anchorId="78A559CB">
-          <v:shape id="_x0000_i1044" type="#_x0000_t75" style="width:45.75pt;height:23.25pt" o:ole="">
+          <v:shape id="_x0000_i1043" type="#_x0000_t75" style="width:45.6pt;height:23.4pt" o:ole="">
             <v:imagedata r:id="rId37" o:title=""/>
           </v:shape>
-          <o:OLEObject Type="Embed" ProgID="Equation.DSMT4" ShapeID="_x0000_i1044" DrawAspect="Content" ObjectID="_1844965131" r:id="rId44"/>
+          <o:OLEObject Type="Embed" ProgID="Equation.DSMT4" ShapeID="_x0000_i1043" DrawAspect="Content" ObjectID="_1849804666" r:id="rId45"/>
         </w:object>
       </w:r>
       <w:r>
         <w:rPr>
           <w:szCs w:val="24"/>
         </w:rPr>
+        <w:t xml:space="preserve"> or </w:t>
+      </w:r>
+      <w:r>
+        <w:rPr>
+          <w:position w:val="-20"/>
+          <w:szCs w:val="24"/>
+        </w:rPr>
+        <w:object w:dxaOrig="920" w:dyaOrig="460" w14:anchorId="78A559CB">
+          <v:shape id="_x0000_i1044" type="#_x0000_t75" style="width:45.6pt;height:23.4pt" o:ole="">
+            <v:imagedata r:id="rId39" o:title=""/>
+          </v:shape>
+          <o:OLEObject Type="Embed" ProgID="Equation.DSMT4" ShapeID="_x0000_i1044" DrawAspect="Content" ObjectID="_1849804667" r:id="rId46"/>
+        </w:object>
+      </w:r>
+      <w:r>
+        <w:rPr>
+          <w:szCs w:val="24"/>
+        </w:rPr>
         <w:t xml:space="preserve"> do not exist.</w:t>
       </w:r>
       <w:r>
         <w:rPr>
           <w:szCs w:val="24"/>
         </w:rPr>
-        <w:t xml:space="preserve">  If the statement is true provide a justification demonstrating that it is true.  If the statement is false, provide a counter-example that shows the statement is false.</w:t>
+        <w:t xml:space="preserve">  If the statement is true provide a justification demonstrating that it is true.  If the statement is false, provide a </w:t>
+      </w:r>
+      <w:proofErr w:type="gramStart"/>
+      <w:r>
+        <w:rPr>
+          <w:szCs w:val="24"/>
+        </w:rPr>
+        <w:t>counter-example</w:t>
+      </w:r>
+      <w:proofErr w:type="gramEnd"/>
+      <w:r>
+        <w:rPr>
+          <w:szCs w:val="24"/>
+        </w:rPr>
+        <w:t xml:space="preserve"> that shows the statement is false.</w:t>
       </w:r>
     </w:p>
     <w:p>
@@ -1490,6 +1858,97 @@
         </w:rPr>
         <w:t>Now we turn to some more atypical questions to challenge or understanding of the topics of this chapter thus far.</w:t>
       </w:r>
+    </w:p>
+    <w:p>
+      <w:pPr>
+        <w:rPr>
+          <w:szCs w:val="24"/>
+        </w:rPr>
+      </w:pPr>
+    </w:p>
+    <w:p>
+      <w:pPr>
+        <w:rPr>
+          <w:szCs w:val="24"/>
+        </w:rPr>
+      </w:pPr>
+    </w:p>
+    <w:p>
+      <w:pPr>
+        <w:rPr>
+          <w:szCs w:val="24"/>
+        </w:rPr>
+      </w:pPr>
+    </w:p>
+    <w:p>
+      <w:pPr>
+        <w:rPr>
+          <w:szCs w:val="24"/>
+        </w:rPr>
+      </w:pPr>
+    </w:p>
+    <w:p>
+      <w:pPr>
+        <w:rPr>
+          <w:szCs w:val="24"/>
+        </w:rPr>
+      </w:pPr>
+    </w:p>
+    <w:p>
+      <w:pPr>
+        <w:rPr>
+          <w:szCs w:val="24"/>
+        </w:rPr>
+      </w:pPr>
+    </w:p>
+    <w:p>
+      <w:pPr>
+        <w:rPr>
+          <w:szCs w:val="24"/>
+        </w:rPr>
+      </w:pPr>
+    </w:p>
+    <w:p>
+      <w:pPr>
+        <w:rPr>
+          <w:szCs w:val="24"/>
+        </w:rPr>
+      </w:pPr>
+    </w:p>
+    <w:p>
+      <w:pPr>
+        <w:rPr>
+          <w:szCs w:val="24"/>
+        </w:rPr>
+      </w:pPr>
+    </w:p>
+    <w:p>
+      <w:pPr>
+        <w:rPr>
+          <w:szCs w:val="24"/>
+        </w:rPr>
+      </w:pPr>
+    </w:p>
+    <w:p>
+      <w:pPr>
+        <w:rPr>
+          <w:szCs w:val="24"/>
+        </w:rPr>
+      </w:pPr>
+    </w:p>
+    <w:p>
+      <w:pPr>
+        <w:rPr>
+          <w:szCs w:val="24"/>
+        </w:rPr>
+      </w:pPr>
+    </w:p>
+    <w:p>
+      <w:pPr>
+        <w:rPr>
+          <w:szCs w:val="24"/>
+        </w:rPr>
+      </w:pPr>
     </w:p>
     <w:p>
       <w:pPr>
@@ -1513,6 +1972,7 @@
         <w:rPr>
           <w:noProof/>
         </w:rPr>
+        <w:lastRenderedPageBreak/>
         <w:drawing>
           <wp:anchor distT="0" distB="0" distL="114300" distR="114300" simplePos="0" relativeHeight="251659264" behindDoc="0" locked="0" layoutInCell="1" allowOverlap="1" wp14:anchorId="2E37FFDC" wp14:editId="31CAB3E5">
             <wp:simplePos x="0" y="0"/>
@@ -1537,7 +1997,7 @@
                     <pic:cNvPicPr/>
                   </pic:nvPicPr>
                   <pic:blipFill>
-                    <a:blip r:embed="rId45">
+                    <a:blip r:embed="rId47">
                       <a:extLst>
                         <a:ext uri="{28A0092B-C50C-407E-A947-70E740481C1C}">
                           <a14:useLocalDpi xmlns:a14="http://schemas.microsoft.com/office/drawing/2010/main" val="0"/>
@@ -1576,7 +2036,14 @@
         <w:rPr>
           <w:szCs w:val="24"/>
         </w:rPr>
-        <w:t xml:space="preserve">The function </w:t>
+        <w:t xml:space="preserve">The </w:t>
+      </w:r>
+      <w:proofErr w:type="gramStart"/>
+      <w:r>
+        <w:rPr>
+          <w:szCs w:val="24"/>
+        </w:rPr>
+        <w:t xml:space="preserve">function </w:t>
       </w:r>
       <w:r>
         <w:rPr>
@@ -1586,6 +2053,7 @@
         </w:rPr>
         <w:t>f</w:t>
       </w:r>
+      <w:proofErr w:type="gramEnd"/>
       <w:r>
         <w:rPr>
           <w:szCs w:val="24"/>
@@ -1598,46 +2066,46 @@
           <w:szCs w:val="24"/>
         </w:rPr>
         <w:object w:dxaOrig="639" w:dyaOrig="400" w14:anchorId="69E55930">
-          <v:shape id="_x0000_i1045" type="#_x0000_t75" style="width:33.75pt;height:20.25pt" o:ole="">
-            <v:imagedata r:id="rId46" o:title=""/>
-          </v:shape>
-          <o:OLEObject Type="Embed" ProgID="Equation.DSMT4" ShapeID="_x0000_i1045" DrawAspect="Content" ObjectID="_1844965132" r:id="rId47"/>
-        </w:object>
-      </w:r>
-      <w:r>
-        <w:rPr>
-          <w:szCs w:val="24"/>
-        </w:rPr>
-        <w:t xml:space="preserve">.  Define </w:t>
-      </w:r>
-      <w:r>
-        <w:rPr>
-          <w:position w:val="-14"/>
-          <w:szCs w:val="24"/>
-        </w:rPr>
-        <w:object w:dxaOrig="859" w:dyaOrig="400" w14:anchorId="1E9B84D8">
-          <v:shape id="_x0000_i1046" type="#_x0000_t75" style="width:42.75pt;height:20.25pt" o:ole="">
+          <v:shape id="_x0000_i1045" type="#_x0000_t75" style="width:33.6pt;height:20.4pt" o:ole="">
             <v:imagedata r:id="rId48" o:title=""/>
           </v:shape>
-          <o:OLEObject Type="Embed" ProgID="Equation.DSMT4" ShapeID="_x0000_i1046" DrawAspect="Content" ObjectID="_1844965133" r:id="rId49"/>
+          <o:OLEObject Type="Embed" ProgID="Equation.DSMT4" ShapeID="_x0000_i1045" DrawAspect="Content" ObjectID="_1849804668" r:id="rId49"/>
         </w:object>
       </w:r>
       <w:r>
         <w:rPr>
           <w:szCs w:val="24"/>
         </w:rPr>
-        <w:t xml:space="preserve">to be the area from 1 to </w:t>
-      </w:r>
-      <w:r>
-        <w:rPr>
-          <w:position w:val="-6"/>
-          <w:szCs w:val="24"/>
-        </w:rPr>
-        <w:object w:dxaOrig="480" w:dyaOrig="279" w14:anchorId="4F44165A">
-          <v:shape id="_x0000_i1047" type="#_x0000_t75" style="width:23.25pt;height:14.25pt" o:ole="">
+        <w:t xml:space="preserve">.  Define </w:t>
+      </w:r>
+      <w:r>
+        <w:rPr>
+          <w:position w:val="-14"/>
+          <w:szCs w:val="24"/>
+        </w:rPr>
+        <w:object w:dxaOrig="859" w:dyaOrig="400" w14:anchorId="1E9B84D8">
+          <v:shape id="_x0000_i1046" type="#_x0000_t75" style="width:42.6pt;height:20.4pt" o:ole="">
             <v:imagedata r:id="rId50" o:title=""/>
           </v:shape>
-          <o:OLEObject Type="Embed" ProgID="Equation.DSMT4" ShapeID="_x0000_i1047" DrawAspect="Content" ObjectID="_1844965134" r:id="rId51"/>
+          <o:OLEObject Type="Embed" ProgID="Equation.DSMT4" ShapeID="_x0000_i1046" DrawAspect="Content" ObjectID="_1849804669" r:id="rId51"/>
+        </w:object>
+      </w:r>
+      <w:r>
+        <w:rPr>
+          <w:szCs w:val="24"/>
+        </w:rPr>
+        <w:t xml:space="preserve">to be the area from 1 to </w:t>
+      </w:r>
+      <w:r>
+        <w:rPr>
+          <w:position w:val="-6"/>
+          <w:szCs w:val="24"/>
+        </w:rPr>
+        <w:object w:dxaOrig="480" w:dyaOrig="279" w14:anchorId="4F44165A">
+          <v:shape id="_x0000_i1047" type="#_x0000_t75" style="width:23.4pt;height:14.4pt" o:ole="">
+            <v:imagedata r:id="rId52" o:title=""/>
+          </v:shape>
+          <o:OLEObject Type="Embed" ProgID="Equation.DSMT4" ShapeID="_x0000_i1047" DrawAspect="Content" ObjectID="_1849804670" r:id="rId53"/>
         </w:object>
       </w:r>
       <w:r>
@@ -1757,10 +2225,10 @@
           <w:szCs w:val="24"/>
         </w:rPr>
         <w:object w:dxaOrig="1300" w:dyaOrig="660" w14:anchorId="021A6A45">
-          <v:shape id="_x0000_i1048" type="#_x0000_t75" style="width:64.5pt;height:33.75pt" o:ole="">
-            <v:imagedata r:id="rId52" o:title=""/>
+          <v:shape id="_x0000_i1048" type="#_x0000_t75" style="width:64.2pt;height:33.6pt" o:ole="">
+            <v:imagedata r:id="rId54" o:title=""/>
           </v:shape>
-          <o:OLEObject Type="Embed" ProgID="Equation.DSMT4" ShapeID="_x0000_i1048" DrawAspect="Content" ObjectID="_1844965135" r:id="rId53"/>
+          <o:OLEObject Type="Embed" ProgID="Equation.DSMT4" ShapeID="_x0000_i1048" DrawAspect="Content" ObjectID="_1849804671" r:id="rId55"/>
         </w:object>
       </w:r>
       <w:r>
@@ -1805,7 +2273,7 @@
                     <pic:cNvPicPr/>
                   </pic:nvPicPr>
                   <pic:blipFill>
-                    <a:blip r:embed="rId54">
+                    <a:blip r:embed="rId56">
                       <a:extLst>
                         <a:ext uri="{28A0092B-C50C-407E-A947-70E740481C1C}">
                           <a14:useLocalDpi xmlns:a14="http://schemas.microsoft.com/office/drawing/2010/main" val="0"/>
@@ -2074,6 +2542,20 @@
     </w:p>
     <w:p>
       <w:pPr>
+        <w:rPr>
+          <w:szCs w:val="24"/>
+        </w:rPr>
+      </w:pPr>
+    </w:p>
+    <w:p>
+      <w:pPr>
+        <w:rPr>
+          <w:szCs w:val="24"/>
+        </w:rPr>
+      </w:pPr>
+    </w:p>
+    <w:p>
+      <w:pPr>
         <w:pStyle w:val="ListParagraph"/>
         <w:numPr>
           <w:ilvl w:val="0"/>
@@ -2087,6 +2569,7 @@
         <w:rPr>
           <w:szCs w:val="24"/>
         </w:rPr>
+        <w:lastRenderedPageBreak/>
         <w:t xml:space="preserve">Is there a value of </w:t>
       </w:r>
       <w:r>
@@ -2109,10 +2592,10 @@
           <w:szCs w:val="24"/>
         </w:rPr>
         <w:object w:dxaOrig="2340" w:dyaOrig="660" w14:anchorId="0C28ECE2">
-          <v:shape id="_x0000_i1049" type="#_x0000_t75" style="width:117pt;height:33.75pt" o:ole="">
-            <v:imagedata r:id="rId55" o:title=""/>
+          <v:shape id="_x0000_i1049" type="#_x0000_t75" style="width:117pt;height:33.6pt" o:ole="">
+            <v:imagedata r:id="rId57" o:title=""/>
           </v:shape>
-          <o:OLEObject Type="Embed" ProgID="Equation.DSMT4" ShapeID="_x0000_i1049" DrawAspect="Content" ObjectID="_1844965136" r:id="rId56"/>
+          <o:OLEObject Type="Embed" ProgID="Equation.DSMT4" ShapeID="_x0000_i1049" DrawAspect="Content" ObjectID="_1849804672" r:id="rId58"/>
         </w:object>
       </w:r>
       <w:r>
@@ -2137,12 +2620,12 @@
       </w:pPr>
     </w:p>
     <w:sectPr>
-      <w:headerReference w:type="even" r:id="rId57"/>
-      <w:headerReference w:type="default" r:id="rId58"/>
-      <w:footerReference w:type="even" r:id="rId59"/>
-      <w:footerReference w:type="default" r:id="rId60"/>
-      <w:headerReference w:type="first" r:id="rId61"/>
-      <w:footerReference w:type="first" r:id="rId62"/>
+      <w:headerReference w:type="even" r:id="rId59"/>
+      <w:headerReference w:type="default" r:id="rId60"/>
+      <w:footerReference w:type="even" r:id="rId61"/>
+      <w:footerReference w:type="default" r:id="rId62"/>
+      <w:headerReference w:type="first" r:id="rId63"/>
+      <w:footerReference w:type="first" r:id="rId64"/>
       <w:pgSz w:w="12240" w:h="15840"/>
       <w:pgMar w:top="720" w:right="720" w:bottom="720" w:left="720" w:header="576" w:footer="720" w:gutter="0"/>
       <w:cols w:space="720"/>

</xml_diff>